<commit_message>
Close the I12 figure decision and regenerate its edit doc
Co-Authored-By: Claude Fable 5.1 <noreply@anthropic.com>
</commit_message>
<xml_diff>
--- a/Module Edit Docs/I12 - Edit Doc.docx
+++ b/Module Edit Docs/I12 - Edit Doc.docx
@@ -75,10 +75,10 @@
       <w:r>
         <w:rPr>
           <w:i/>
-          <w:color w:val="0050A0"/>
+          <w:color w:val="5A5A5A"/>
           <w:sz w:val="19"/>
         </w:rPr>
-        <w:t>[DECISION: Gustavo's C6 comment ("keep both of the figures or replace the one from the deck") anchors five pasted raster images at four locations: two beside the existing transmural-afterload figure and the v2022 slide153 mechanism diagram, one after the new mechanism 1-3 summary sentence, one before the phase-delay section, one after the spontaneous-breathing reversal paragraph. All five are polished multi-panel HemoSim-branded infographics, not the site's hand-drawn SVG house style, and none was applied. Neal to decide whether any should become a commissioned SVG and where.]</w:t>
+        <w:t>[NOTE: Gustavo's C6 comment ("keep both of the figures or replace the one from the deck") was settled by Neal on 2026-09-13: his four pasted infographics (heart-lung interactions under positive pressure, the RV during positive-pressure inspiration, pulmonary blood volume and the delay to the left heart, the RV during normal inspiration) are on the page as JPEGs beside the existing figures, credited to him in the caption. Neal also struck the deck attribution from the four v2022 slide captions, which now cite Michard 2005 and Pinsky 1985 directly. The doc held four pasted images, not five: the other two media files are the generator's renderings of the page's own SVGs.]</w:t>
       </w:r>
     </w:p>
     <w:p/>
@@ -224,8 +224,63 @@
       <w:r>
         <w:drawing>
           <wp:inline xmlns:a="http://schemas.openxmlformats.org/drawingml/2006/main" xmlns:pic="http://schemas.openxmlformats.org/drawingml/2006/picture">
+            <wp:extent cx="2834640" cy="2125980"/>
+            <wp:docPr id="2" name="Picture 2"/>
+            <wp:cNvGraphicFramePr>
+              <a:graphicFrameLocks noChangeAspect="1"/>
+            </wp:cNvGraphicFramePr>
+            <a:graphic>
+              <a:graphicData uri="http://schemas.openxmlformats.org/drawingml/2006/picture">
+                <pic:pic>
+                  <pic:nvPicPr>
+                    <pic:cNvPr id="0" name="i12-ppv-normal-physiology.jpg"/>
+                    <pic:cNvPicPr/>
+                  </pic:nvPicPr>
+                  <pic:blipFill>
+                    <a:blip r:embed="rId10"/>
+                    <a:stretch>
+                      <a:fillRect/>
+                    </a:stretch>
+                  </pic:blipFill>
+                  <pic:spPr>
+                    <a:xfrm>
+                      <a:off x="0" y="0"/>
+                      <a:ext cx="2834640" cy="2125980"/>
+                    </a:xfrm>
+                    <a:prstGeom prst="rect"/>
+                  </pic:spPr>
+                </pic:pic>
+              </a:graphicData>
+            </a:graphic>
+          </wp:inline>
+        </w:drawing>
+      </w:r>
+    </w:p>
+    <w:p>
+      <w:r>
+        <w:rPr>
+          <w:color w:val="777777"/>
+          <w:sz w:val="19"/>
+        </w:rPr>
+        <w:t>Heart-lung interactions under positive-pressure ventilation in a healthy subject. The top row contrasts the pressure changes of a spontaneous and a positive-pressure inspiration. The numbered steps follow one delivered breath: airway, alveolar, pleural and transpulmonary pressure rise, venous return and right ventricular preload fall slightly, pulmonary vascular load changes modestly, left ventricular transmural afterload falls, and left ventricular preload falls after a short delay. The arterial trace at the bottom shows the small respiratory oscillation that results, well tolerated in health. Drawn by Gustavo García Chávez for this module.</w:t>
+      </w:r>
+    </w:p>
+    <w:p>
+      <w:r>
+        <w:rPr>
+          <w:i/>
+          <w:color w:val="C0392B"/>
+          <w:sz w:val="19"/>
+        </w:rPr>
+        <w:t>[Layout note: figure shown small here. On the web it is currently full column width, about 750px. Say if you want it smaller/larger, moved, cropped, or replaced.]</w:t>
+      </w:r>
+    </w:p>
+    <w:p>
+      <w:r>
+        <w:drawing>
+          <wp:inline xmlns:a="http://schemas.openxmlformats.org/drawingml/2006/main" xmlns:pic="http://schemas.openxmlformats.org/drawingml/2006/picture">
             <wp:extent cx="2834640" cy="1578825"/>
-            <wp:docPr id="2" name="Picture 2"/>
+            <wp:docPr id="3" name="Picture 3"/>
             <wp:cNvGraphicFramePr>
               <a:graphicFrameLocks noChangeAspect="1"/>
             </wp:cNvGraphicFramePr>
@@ -237,7 +292,7 @@
                     <pic:cNvPicPr/>
                   </pic:nvPicPr>
                   <pic:blipFill>
-                    <a:blip r:embed="rId10"/>
+                    <a:blip r:embed="rId11"/>
                     <a:stretch>
                       <a:fillRect/>
                     </a:stretch>
@@ -262,7 +317,7 @@
           <w:color w:val="777777"/>
           <w:sz w:val="19"/>
         </w:rPr>
-        <w:t>The five mechanisms on one diagram. Positions 1 and 2 are the venous effects, 3 is the effect on right ventricular afterload, 4 is the displacement of pulmonary blood toward the left atrium, and 5 is the fall in left ventricular transmural pressure. The zone labels on the pulmonary bed are taken up where they govern wedge validity, in Module I15.Source: HemoSim hemodynamics module (v2022), slide 153, after Michard, Anesthesiology 2005.</w:t>
+        <w:t>The five mechanisms on one diagram. Positions 1 and 2 are the venous effects, 3 is the effect on right ventricular afterload, 4 is the displacement of pulmonary blood toward the left atrium, and 5 is the fall in left ventricular transmural pressure. The zone labels on the pulmonary bed are taken up where they govern wedge validity, in Module I15.Source: Michard, Anesthesiology 2005.</w:t>
       </w:r>
     </w:p>
     <w:p>
@@ -301,6 +356,61 @@
     <w:p>
       <w:r>
         <w:t>All three mechanisms tend to reduce right ventricular stroke volume during positive-pressure inspiration, either through reduced filling or increased impedance to ejection, although their relative contributions vary from patient to patient.</w:t>
+      </w:r>
+    </w:p>
+    <w:p>
+      <w:r>
+        <w:drawing>
+          <wp:inline xmlns:a="http://schemas.openxmlformats.org/drawingml/2006/main" xmlns:pic="http://schemas.openxmlformats.org/drawingml/2006/picture">
+            <wp:extent cx="2834640" cy="2125980"/>
+            <wp:docPr id="4" name="Picture 4"/>
+            <wp:cNvGraphicFramePr>
+              <a:graphicFrameLocks noChangeAspect="1"/>
+            </wp:cNvGraphicFramePr>
+            <a:graphic>
+              <a:graphicData uri="http://schemas.openxmlformats.org/drawingml/2006/picture">
+                <pic:pic>
+                  <pic:nvPicPr>
+                    <pic:cNvPr id="0" name="i12-rv-positive-pressure-inspiration.jpg"/>
+                    <pic:cNvPicPr/>
+                  </pic:nvPicPr>
+                  <pic:blipFill>
+                    <a:blip r:embed="rId12"/>
+                    <a:stretch>
+                      <a:fillRect/>
+                    </a:stretch>
+                  </pic:blipFill>
+                  <pic:spPr>
+                    <a:xfrm>
+                      <a:off x="0" y="0"/>
+                      <a:ext cx="2834640" cy="2125980"/>
+                    </a:xfrm>
+                    <a:prstGeom prst="rect"/>
+                  </pic:spPr>
+                </pic:pic>
+              </a:graphicData>
+            </a:graphic>
+          </wp:inline>
+        </w:drawing>
+      </w:r>
+    </w:p>
+    <w:p>
+      <w:r>
+        <w:rPr>
+          <w:color w:val="777777"/>
+          <w:sz w:val="19"/>
+        </w:rPr>
+        <w:t>The right ventricle during positive-pressure inspiration. Venous return and right ventricular preload fall slightly, transpulmonary pressure rises, alveolar vessels are compressed while extra-alveolar vessels open, and the net change in pulmonary vascular load is modest near functional residual capacity. The lower panels show the expected pulmonary artery pressure, central venous pressure and right ventricular stroke volume traces in a healthy subject. Drawn by Gustavo García Chávez for this module.</w:t>
+      </w:r>
+    </w:p>
+    <w:p>
+      <w:r>
+        <w:rPr>
+          <w:i/>
+          <w:color w:val="C0392B"/>
+          <w:sz w:val="19"/>
+        </w:rPr>
+        <w:t>[Layout note: figure shown small here. On the web it is currently full column width, about 750px. Say if you want it smaller/larger, moved, cropped, or replaced.]</w:t>
       </w:r>
     </w:p>
     <w:p>
@@ -716,6 +826,61 @@
     </w:p>
     <w:p>
       <w:r>
+        <w:drawing>
+          <wp:inline xmlns:a="http://schemas.openxmlformats.org/drawingml/2006/main" xmlns:pic="http://schemas.openxmlformats.org/drawingml/2006/picture">
+            <wp:extent cx="2834640" cy="2125980"/>
+            <wp:docPr id="5" name="Picture 5"/>
+            <wp:cNvGraphicFramePr>
+              <a:graphicFrameLocks noChangeAspect="1"/>
+            </wp:cNvGraphicFramePr>
+            <a:graphic>
+              <a:graphicData uri="http://schemas.openxmlformats.org/drawingml/2006/picture">
+                <pic:pic>
+                  <pic:nvPicPr>
+                    <pic:cNvPr id="0" name="i12-pulmonary-blood-volume-delay.jpg"/>
+                    <pic:cNvPicPr/>
+                  </pic:nvPicPr>
+                  <pic:blipFill>
+                    <a:blip r:embed="rId13"/>
+                    <a:stretch>
+                      <a:fillRect/>
+                    </a:stretch>
+                  </pic:blipFill>
+                  <pic:spPr>
+                    <a:xfrm>
+                      <a:off x="0" y="0"/>
+                      <a:ext cx="2834640" cy="2125980"/>
+                    </a:xfrm>
+                    <a:prstGeom prst="rect"/>
+                  </pic:spPr>
+                </pic:pic>
+              </a:graphicData>
+            </a:graphic>
+          </wp:inline>
+        </w:drawing>
+      </w:r>
+    </w:p>
+    <w:p>
+      <w:r>
+        <w:rPr>
+          <w:color w:val="777777"/>
+          <w:sz w:val="19"/>
+        </w:rPr>
+        <w:t>Pulmonary blood volume and the delay to the left heart. The onset of inspiration reduces venous return and right ventricular preload first, early inspiration displaces pulmonary capillary blood toward the left atrium and transiently supports left ventricular filling, and the reduced right ventricular output reaches the left ventricle only after several beats of pulmonary transit. The arterial pressure waveform is therefore a delayed, integrated signal rather than an instantaneous mirror of venous return. Drawn by Gustavo García Chávez for this module.</w:t>
+      </w:r>
+    </w:p>
+    <w:p>
+      <w:r>
+        <w:rPr>
+          <w:i/>
+          <w:color w:val="C0392B"/>
+          <w:sz w:val="19"/>
+        </w:rPr>
+        <w:t>[Layout note: figure shown small here. On the web it is currently full column width, about 750px. Say if you want it smaller/larger, moved, cropped, or replaced.]</w:t>
+      </w:r>
+    </w:p>
+    <w:p>
+      <w:r>
         <w:t>Everything above concerns one inspiration acting on two ventricles in opposite directions. The reason the pattern is legible at the bedside, rather than cancelling into noise, is that the two effects do not arrive at the aorta at the same time.</w:t>
       </w:r>
     </w:p>
@@ -724,7 +889,7 @@
         <w:drawing>
           <wp:inline xmlns:a="http://schemas.openxmlformats.org/drawingml/2006/main" xmlns:pic="http://schemas.openxmlformats.org/drawingml/2006/picture">
             <wp:extent cx="2834640" cy="1700784"/>
-            <wp:docPr id="3" name="Picture 3"/>
+            <wp:docPr id="6" name="Picture 6"/>
             <wp:cNvGraphicFramePr>
               <a:graphicFrameLocks noChangeAspect="1"/>
             </wp:cNvGraphicFramePr>
@@ -736,7 +901,7 @@
                     <pic:cNvPicPr/>
                   </pic:nvPicPr>
                   <pic:blipFill>
-                    <a:blip r:embed="rId11"/>
+                    <a:blip r:embed="rId14"/>
                     <a:stretch>
                       <a:fillRect/>
                     </a:stretch>
@@ -761,7 +926,7 @@
           <w:color w:val="777777"/>
           <w:sz w:val="19"/>
         </w:rPr>
-        <w:t>The three flows recorded together through two mechanical breaths. Caval flow (bottom) falls immediately at the onset of inspiration. Pulmonary artery flow (middle) falls next. Aortic flow (top) is increased during the same inspiration, and its trough arrives later, in expiration. The right-sided and left-sided consequences of one breath are separated in time by the transit through the lungs.Source: HemoSim hemodynamics module (v2022), slide 154, after Michard, Anesthesiology 2005.</w:t>
+        <w:t>The three flows recorded together through two mechanical breaths. Caval flow (bottom) falls immediately at the onset of inspiration. Pulmonary artery flow (middle) falls next. Aortic flow (top) is increased during the same inspiration, and its trough arrives later, in expiration. The right-sided and left-sided consequences of one breath are separated in time by the transit through the lungs.Source: Michard, Anesthesiology 2005.</w:t>
       </w:r>
     </w:p>
     <w:p>
@@ -803,7 +968,7 @@
         <w:drawing>
           <wp:inline xmlns:a="http://schemas.openxmlformats.org/drawingml/2006/main" xmlns:pic="http://schemas.openxmlformats.org/drawingml/2006/picture">
             <wp:extent cx="2834640" cy="893060"/>
-            <wp:docPr id="4" name="Picture 4"/>
+            <wp:docPr id="7" name="Picture 7"/>
             <wp:cNvGraphicFramePr>
               <a:graphicFrameLocks noChangeAspect="1"/>
             </wp:cNvGraphicFramePr>
@@ -815,7 +980,7 @@
                     <pic:cNvPicPr/>
                   </pic:nvPicPr>
                   <pic:blipFill>
-                    <a:blip r:embed="rId12"/>
+                    <a:blip r:embed="rId15"/>
                     <a:stretch>
                       <a:fillRect/>
                     </a:stretch>
@@ -840,7 +1005,7 @@
           <w:color w:val="777777"/>
           <w:sz w:val="19"/>
         </w:rPr>
-        <w:t>Right and left ventricular stroke volume recorded beat by beat through spontaneous and positive pressure breaths. The cyclic modulation is present on both sides in both modes, and in both modes the two ventricles are out of step with each other.Source: HemoSim hemodynamics module (v2022), slide 169, after Pinsky, Matuschak and Klain, J Appl Physiol 1985.</w:t>
+        <w:t>Right and left ventricular stroke volume recorded beat by beat through spontaneous and positive pressure breaths. The cyclic modulation is present on both sides in both modes, and in both modes the two ventricles are out of step with each other.Source: Pinsky, Matuschak and Klain, J Appl Physiol 1985.</w:t>
       </w:r>
     </w:p>
     <w:p>
@@ -896,7 +1061,7 @@
         <w:drawing>
           <wp:inline xmlns:a="http://schemas.openxmlformats.org/drawingml/2006/main" xmlns:pic="http://schemas.openxmlformats.org/drawingml/2006/picture">
             <wp:extent cx="2834640" cy="1766235"/>
-            <wp:docPr id="5" name="Picture 5"/>
+            <wp:docPr id="8" name="Picture 8"/>
             <wp:cNvGraphicFramePr>
               <a:graphicFrameLocks noChangeAspect="1"/>
             </wp:cNvGraphicFramePr>
@@ -908,7 +1073,7 @@
                     <pic:cNvPicPr/>
                   </pic:nvPicPr>
                   <pic:blipFill>
-                    <a:blip r:embed="rId13"/>
+                    <a:blip r:embed="rId16"/>
                     <a:stretch>
                       <a:fillRect/>
                     </a:stretch>
@@ -933,7 +1098,7 @@
           <w:color w:val="777777"/>
           <w:sz w:val="19"/>
         </w:rPr>
-        <w:t>The same arterial signal displayed two ways. At the sweep speed and scale used for routine monitoring, the respiratory modulation is invisible because too few respiratory cycles fit on the screen. Slowing the sweep and expanding the vertical scale makes an unremarkable trace legible.Source: HemoSim hemodynamics module (v2022), slide 152, after Michard, Anesthesiology 2005.</w:t>
+        <w:t>The same arterial signal displayed two ways. At the sweep speed and scale used for routine monitoring, the respiratory modulation is invisible because too few respiratory cycles fit on the screen. Slowing the sweep and expanding the vertical scale makes an unremarkable trace legible.Source: Michard, Anesthesiology 2005.</w:t>
       </w:r>
     </w:p>
     <w:p>
@@ -971,6 +1136,61 @@
     </w:p>
     <w:p>
       <w:r>
+        <w:drawing>
+          <wp:inline xmlns:a="http://schemas.openxmlformats.org/drawingml/2006/main" xmlns:pic="http://schemas.openxmlformats.org/drawingml/2006/picture">
+            <wp:extent cx="2834640" cy="2125980"/>
+            <wp:docPr id="9" name="Picture 9"/>
+            <wp:cNvGraphicFramePr>
+              <a:graphicFrameLocks noChangeAspect="1"/>
+            </wp:cNvGraphicFramePr>
+            <a:graphic>
+              <a:graphicData uri="http://schemas.openxmlformats.org/drawingml/2006/picture">
+                <pic:pic>
+                  <pic:nvPicPr>
+                    <pic:cNvPr id="0" name="i12-rv-normal-inspiration.jpg"/>
+                    <pic:cNvPicPr/>
+                  </pic:nvPicPr>
+                  <pic:blipFill>
+                    <a:blip r:embed="rId17"/>
+                    <a:stretch>
+                      <a:fillRect/>
+                    </a:stretch>
+                  </pic:blipFill>
+                  <pic:spPr>
+                    <a:xfrm>
+                      <a:off x="0" y="0"/>
+                      <a:ext cx="2834640" cy="2125980"/>
+                    </a:xfrm>
+                    <a:prstGeom prst="rect"/>
+                  </pic:spPr>
+                </pic:pic>
+              </a:graphicData>
+            </a:graphic>
+          </wp:inline>
+        </w:drawing>
+      </w:r>
+    </w:p>
+    <w:p>
+      <w:r>
+        <w:rPr>
+          <w:color w:val="777777"/>
+          <w:sz w:val="19"/>
+        </w:rPr>
+        <w:t>The right ventricle during quiet spontaneous inspiration. Diaphragmatic descent lowers intrathoracic pressure, venous return and right ventricular filling rise, a compliant right ventricle accepts the extra preload with a small rise in pressure, and the opposing effects of alveolar expansion on alveolar and extra-alveolar vessels leave pulmonary vascular load little changed. The result is a small respiratory oscillation in stroke volume rather than instability. Drawn by Gustavo García Chávez for this module.</w:t>
+      </w:r>
+    </w:p>
+    <w:p>
+      <w:r>
+        <w:rPr>
+          <w:i/>
+          <w:color w:val="C0392B"/>
+          <w:sz w:val="19"/>
+        </w:rPr>
+        <w:t>[Layout note: figure shown small here. On the web it is currently full column width, about 750px. Say if you want it smaller/larger, moved, cropped, or replaced.]</w:t>
+      </w:r>
+    </w:p>
+    <w:p>
+      <w:r>
         <w:t>Inspiratory descent of the diaphragm makes pleural pressure more negative. Right atrial pressure falls with it, which widens the gradient for venous return, and at the same time diaphragmatic descent raises abdominal pressure and can recruit blood from the splanchnic reservoir toward the thorax. Both effects favour filling, so spontaneous inspiration increases venous return, which is the exact opposite of mechanism 2. The increase is not unlimited, because the collapsible segment at the thoraco-abdominal junction imposes a ceiling once the pressure inside the vessel falls to the pressure around it, and Module I8 makes the point that a very large inspiratory effort therefore buys no additional venous return while continuing to load the left ventricle. Mechanism 3 is less simply reversed: increasingly negative pleural pressure distends extra-alveolar vessels, while the simultaneous increase in lung volume can still compress alveolar vessels, so the net change in pulmonary vascular load depends on where the lung begins and how far it expands.</w:t>
       </w:r>
     </w:p>
@@ -989,7 +1209,7 @@
         <w:drawing>
           <wp:inline xmlns:a="http://schemas.openxmlformats.org/drawingml/2006/main" xmlns:pic="http://schemas.openxmlformats.org/drawingml/2006/picture">
             <wp:extent cx="2834640" cy="2834640"/>
-            <wp:docPr id="6" name="Picture 6"/>
+            <wp:docPr id="10" name="Picture 10"/>
             <wp:cNvGraphicFramePr>
               <a:graphicFrameLocks noChangeAspect="1"/>
             </wp:cNvGraphicFramePr>
@@ -1001,7 +1221,7 @@
                     <pic:cNvPicPr/>
                   </pic:nvPicPr>
                   <pic:blipFill>
-                    <a:blip r:embed="rId14"/>
+                    <a:blip r:embed="rId18"/>
                     <a:stretch>
                       <a:fillRect/>
                     </a:stretch>

</xml_diff>